<commit_message>
complete Advanced SQL Server
</commit_message>
<xml_diff>
--- a/Advanced-sql-server/EmployeeManagementSystemTriggers/EmployeeManagementSystemTriggers.docx
+++ b/Advanced-sql-server/EmployeeManagementSystemTriggers/EmployeeManagementSystemTriggers.docx
@@ -65,6 +65,7 @@
         <w:rPr>
           <w:b/>
           <w:bCs/>
+          <w:noProof/>
           <w:sz w:val="28"/>
           <w:szCs w:val="28"/>
         </w:rPr>
@@ -121,30 +122,50 @@
           <w:sz w:val="28"/>
           <w:szCs w:val="28"/>
         </w:rPr>
-        <w:t>Exercise 1: Create an After Trigger</w:t>
-      </w:r>
-    </w:p>
-    <w:p>
-      <w:pPr>
-        <w:rPr>
-          <w:b/>
-          <w:bCs/>
-          <w:sz w:val="28"/>
-          <w:szCs w:val="28"/>
-        </w:rPr>
-      </w:pPr>
-      <w:r>
-        <w:rPr>
-          <w:b/>
-          <w:bCs/>
+        <w:t>Exercise 1: Create an</w:t>
+      </w:r>
+      <w:r>
+        <w:rPr>
+          <w:b/>
+          <w:bCs/>
+          <w:sz w:val="28"/>
+          <w:szCs w:val="28"/>
+        </w:rPr>
+        <w:t xml:space="preserve"> AFTER</w:t>
+      </w:r>
+      <w:r>
+        <w:rPr>
+          <w:b/>
+          <w:bCs/>
+          <w:sz w:val="28"/>
+          <w:szCs w:val="28"/>
+        </w:rPr>
+        <w:t xml:space="preserve"> Trigger</w:t>
+      </w:r>
+    </w:p>
+    <w:p>
+      <w:pPr>
+        <w:rPr>
+          <w:b/>
+          <w:bCs/>
+          <w:noProof/>
+          <w:sz w:val="28"/>
+          <w:szCs w:val="28"/>
+        </w:rPr>
+      </w:pPr>
+      <w:r>
+        <w:rPr>
+          <w:b/>
+          <w:bCs/>
+          <w:noProof/>
           <w:sz w:val="28"/>
           <w:szCs w:val="28"/>
         </w:rPr>
         <w:drawing>
-          <wp:inline distT="0" distB="0" distL="0" distR="0" wp14:anchorId="0B380EF6" wp14:editId="2B7E2615">
-            <wp:extent cx="5731510" cy="3096260"/>
-            <wp:effectExtent l="0" t="0" r="2540" b="8890"/>
-            <wp:docPr id="1892907184" name="Picture 1"/>
+          <wp:inline distT="0" distB="0" distL="0" distR="0" wp14:anchorId="7B65D7F5" wp14:editId="2C40D04E">
+            <wp:extent cx="5731510" cy="3155950"/>
+            <wp:effectExtent l="0" t="0" r="2540" b="6350"/>
+            <wp:docPr id="2139257314" name="Picture 1"/>
             <wp:cNvGraphicFramePr>
               <a:graphicFrameLocks xmlns:a="http://schemas.openxmlformats.org/drawingml/2006/main" noChangeAspect="1"/>
             </wp:cNvGraphicFramePr>
@@ -152,7 +173,7 @@
               <a:graphicData uri="http://schemas.openxmlformats.org/drawingml/2006/picture">
                 <pic:pic xmlns:pic="http://schemas.openxmlformats.org/drawingml/2006/picture">
                   <pic:nvPicPr>
-                    <pic:cNvPr id="1892907184" name=""/>
+                    <pic:cNvPr id="2139257314" name=""/>
                     <pic:cNvPicPr/>
                   </pic:nvPicPr>
                   <pic:blipFill>
@@ -164,7 +185,7 @@
                   <pic:spPr>
                     <a:xfrm>
                       <a:off x="0" y="0"/>
-                      <a:ext cx="5731510" cy="3096260"/>
+                      <a:ext cx="5731510" cy="3155950"/>
                     </a:xfrm>
                     <a:prstGeom prst="rect">
                       <a:avLst/>
@@ -182,18 +203,341 @@
         <w:rPr>
           <w:b/>
           <w:bCs/>
-          <w:sz w:val="28"/>
-          <w:szCs w:val="28"/>
-        </w:rPr>
-      </w:pPr>
-      <w:r>
-        <w:rPr>
-          <w:b/>
-          <w:bCs/>
-          <w:sz w:val="28"/>
-          <w:szCs w:val="28"/>
-        </w:rPr>
-        <w:t>Exercise 2: Create an Instead of Trigger</w:t>
+          <w:noProof/>
+          <w:sz w:val="24"/>
+          <w:szCs w:val="24"/>
+        </w:rPr>
+      </w:pPr>
+    </w:p>
+    <w:p>
+      <w:pPr>
+        <w:rPr>
+          <w:b/>
+          <w:bCs/>
+          <w:noProof/>
+          <w:sz w:val="24"/>
+          <w:szCs w:val="24"/>
+        </w:rPr>
+      </w:pPr>
+    </w:p>
+    <w:p>
+      <w:pPr>
+        <w:rPr>
+          <w:b/>
+          <w:bCs/>
+          <w:noProof/>
+          <w:sz w:val="24"/>
+          <w:szCs w:val="24"/>
+        </w:rPr>
+      </w:pPr>
+    </w:p>
+    <w:p>
+      <w:pPr>
+        <w:rPr>
+          <w:b/>
+          <w:bCs/>
+          <w:noProof/>
+          <w:sz w:val="24"/>
+          <w:szCs w:val="24"/>
+        </w:rPr>
+      </w:pPr>
+      <w:r>
+        <w:rPr>
+          <w:b/>
+          <w:bCs/>
+          <w:noProof/>
+          <w:sz w:val="24"/>
+          <w:szCs w:val="24"/>
+        </w:rPr>
+        <w:lastRenderedPageBreak/>
+        <w:t>Trigger test:</w:t>
+      </w:r>
+    </w:p>
+    <w:p>
+      <w:pPr>
+        <w:rPr>
+          <w:b/>
+          <w:bCs/>
+          <w:sz w:val="28"/>
+          <w:szCs w:val="28"/>
+        </w:rPr>
+      </w:pPr>
+      <w:r>
+        <w:rPr>
+          <w:b/>
+          <w:bCs/>
+          <w:sz w:val="28"/>
+          <w:szCs w:val="28"/>
+        </w:rPr>
+        <w:drawing>
+          <wp:inline distT="0" distB="0" distL="0" distR="0" wp14:anchorId="08FB3298" wp14:editId="177C976F">
+            <wp:extent cx="5731510" cy="3163570"/>
+            <wp:effectExtent l="0" t="0" r="2540" b="0"/>
+            <wp:docPr id="2038615289" name="Picture 1"/>
+            <wp:cNvGraphicFramePr>
+              <a:graphicFrameLocks xmlns:a="http://schemas.openxmlformats.org/drawingml/2006/main" noChangeAspect="1"/>
+            </wp:cNvGraphicFramePr>
+            <a:graphic xmlns:a="http://schemas.openxmlformats.org/drawingml/2006/main">
+              <a:graphicData uri="http://schemas.openxmlformats.org/drawingml/2006/picture">
+                <pic:pic xmlns:pic="http://schemas.openxmlformats.org/drawingml/2006/picture">
+                  <pic:nvPicPr>
+                    <pic:cNvPr id="2038615289" name=""/>
+                    <pic:cNvPicPr/>
+                  </pic:nvPicPr>
+                  <pic:blipFill>
+                    <a:blip r:embed="rId8"/>
+                    <a:stretch>
+                      <a:fillRect/>
+                    </a:stretch>
+                  </pic:blipFill>
+                  <pic:spPr>
+                    <a:xfrm>
+                      <a:off x="0" y="0"/>
+                      <a:ext cx="5731510" cy="3163570"/>
+                    </a:xfrm>
+                    <a:prstGeom prst="rect">
+                      <a:avLst/>
+                    </a:prstGeom>
+                  </pic:spPr>
+                </pic:pic>
+              </a:graphicData>
+            </a:graphic>
+          </wp:inline>
+        </w:drawing>
+      </w:r>
+    </w:p>
+    <w:p>
+      <w:pPr>
+        <w:rPr>
+          <w:b/>
+          <w:bCs/>
+          <w:sz w:val="28"/>
+          <w:szCs w:val="28"/>
+        </w:rPr>
+      </w:pPr>
+      <w:r>
+        <w:rPr>
+          <w:b/>
+          <w:bCs/>
+          <w:sz w:val="28"/>
+          <w:szCs w:val="28"/>
+        </w:rPr>
+        <w:t>Exercise 2: Create an</w:t>
+      </w:r>
+      <w:r>
+        <w:rPr>
+          <w:b/>
+          <w:bCs/>
+          <w:sz w:val="28"/>
+          <w:szCs w:val="28"/>
+        </w:rPr>
+        <w:t xml:space="preserve"> INSTEAD OF</w:t>
+      </w:r>
+      <w:r>
+        <w:rPr>
+          <w:b/>
+          <w:bCs/>
+          <w:sz w:val="28"/>
+          <w:szCs w:val="28"/>
+        </w:rPr>
+        <w:t xml:space="preserve"> Trigger</w:t>
+      </w:r>
+    </w:p>
+    <w:p>
+      <w:pPr>
+        <w:rPr>
+          <w:b/>
+          <w:bCs/>
+          <w:sz w:val="28"/>
+          <w:szCs w:val="28"/>
+        </w:rPr>
+      </w:pPr>
+      <w:r>
+        <w:rPr>
+          <w:b/>
+          <w:bCs/>
+          <w:sz w:val="28"/>
+          <w:szCs w:val="28"/>
+        </w:rPr>
+        <w:drawing>
+          <wp:inline distT="0" distB="0" distL="0" distR="0" wp14:anchorId="7D28745D" wp14:editId="5A41BEB3">
+            <wp:extent cx="5731510" cy="3122930"/>
+            <wp:effectExtent l="0" t="0" r="2540" b="1270"/>
+            <wp:docPr id="1468456115" name="Picture 1"/>
+            <wp:cNvGraphicFramePr>
+              <a:graphicFrameLocks xmlns:a="http://schemas.openxmlformats.org/drawingml/2006/main" noChangeAspect="1"/>
+            </wp:cNvGraphicFramePr>
+            <a:graphic xmlns:a="http://schemas.openxmlformats.org/drawingml/2006/main">
+              <a:graphicData uri="http://schemas.openxmlformats.org/drawingml/2006/picture">
+                <pic:pic xmlns:pic="http://schemas.openxmlformats.org/drawingml/2006/picture">
+                  <pic:nvPicPr>
+                    <pic:cNvPr id="1468456115" name=""/>
+                    <pic:cNvPicPr/>
+                  </pic:nvPicPr>
+                  <pic:blipFill>
+                    <a:blip r:embed="rId9"/>
+                    <a:stretch>
+                      <a:fillRect/>
+                    </a:stretch>
+                  </pic:blipFill>
+                  <pic:spPr>
+                    <a:xfrm>
+                      <a:off x="0" y="0"/>
+                      <a:ext cx="5731510" cy="3122930"/>
+                    </a:xfrm>
+                    <a:prstGeom prst="rect">
+                      <a:avLst/>
+                    </a:prstGeom>
+                  </pic:spPr>
+                </pic:pic>
+              </a:graphicData>
+            </a:graphic>
+          </wp:inline>
+        </w:drawing>
+      </w:r>
+    </w:p>
+    <w:p>
+      <w:pPr>
+        <w:rPr>
+          <w:b/>
+          <w:bCs/>
+          <w:sz w:val="24"/>
+          <w:szCs w:val="24"/>
+        </w:rPr>
+      </w:pPr>
+    </w:p>
+    <w:p>
+      <w:pPr>
+        <w:rPr>
+          <w:b/>
+          <w:bCs/>
+          <w:sz w:val="24"/>
+          <w:szCs w:val="24"/>
+        </w:rPr>
+      </w:pPr>
+    </w:p>
+    <w:p>
+      <w:pPr>
+        <w:rPr>
+          <w:b/>
+          <w:bCs/>
+          <w:sz w:val="24"/>
+          <w:szCs w:val="24"/>
+        </w:rPr>
+      </w:pPr>
+    </w:p>
+    <w:p>
+      <w:pPr>
+        <w:rPr>
+          <w:b/>
+          <w:bCs/>
+          <w:sz w:val="24"/>
+          <w:szCs w:val="24"/>
+        </w:rPr>
+      </w:pPr>
+    </w:p>
+    <w:p>
+      <w:pPr>
+        <w:rPr>
+          <w:b/>
+          <w:bCs/>
+          <w:sz w:val="24"/>
+          <w:szCs w:val="24"/>
+        </w:rPr>
+      </w:pPr>
+    </w:p>
+    <w:p>
+      <w:pPr>
+        <w:rPr>
+          <w:b/>
+          <w:bCs/>
+          <w:sz w:val="24"/>
+          <w:szCs w:val="24"/>
+        </w:rPr>
+      </w:pPr>
+    </w:p>
+    <w:p>
+      <w:pPr>
+        <w:rPr>
+          <w:b/>
+          <w:bCs/>
+          <w:sz w:val="24"/>
+          <w:szCs w:val="24"/>
+        </w:rPr>
+      </w:pPr>
+      <w:r>
+        <w:rPr>
+          <w:b/>
+          <w:bCs/>
+          <w:sz w:val="24"/>
+          <w:szCs w:val="24"/>
+        </w:rPr>
+        <w:t>Trigger test</w:t>
+      </w:r>
+      <w:r>
+        <w:rPr>
+          <w:b/>
+          <w:bCs/>
+          <w:sz w:val="24"/>
+          <w:szCs w:val="24"/>
+        </w:rPr>
+        <w:t>:</w:t>
+      </w:r>
+    </w:p>
+    <w:p>
+      <w:pPr>
+        <w:tabs>
+          <w:tab w:val="left" w:pos="1613"/>
+        </w:tabs>
+        <w:rPr>
+          <w:b/>
+          <w:bCs/>
+          <w:sz w:val="24"/>
+          <w:szCs w:val="24"/>
+        </w:rPr>
+      </w:pPr>
+      <w:r>
+        <w:rPr>
+          <w:b/>
+          <w:bCs/>
+          <w:sz w:val="24"/>
+          <w:szCs w:val="24"/>
+        </w:rPr>
+        <w:drawing>
+          <wp:inline distT="0" distB="0" distL="0" distR="0" wp14:anchorId="40E1BA0A" wp14:editId="3A137C14">
+            <wp:extent cx="5731510" cy="3145790"/>
+            <wp:effectExtent l="0" t="0" r="2540" b="0"/>
+            <wp:docPr id="152674701" name="Picture 1"/>
+            <wp:cNvGraphicFramePr>
+              <a:graphicFrameLocks xmlns:a="http://schemas.openxmlformats.org/drawingml/2006/main" noChangeAspect="1"/>
+            </wp:cNvGraphicFramePr>
+            <a:graphic xmlns:a="http://schemas.openxmlformats.org/drawingml/2006/main">
+              <a:graphicData uri="http://schemas.openxmlformats.org/drawingml/2006/picture">
+                <pic:pic xmlns:pic="http://schemas.openxmlformats.org/drawingml/2006/picture">
+                  <pic:nvPicPr>
+                    <pic:cNvPr id="152674701" name=""/>
+                    <pic:cNvPicPr/>
+                  </pic:nvPicPr>
+                  <pic:blipFill>
+                    <a:blip r:embed="rId10"/>
+                    <a:stretch>
+                      <a:fillRect/>
+                    </a:stretch>
+                  </pic:blipFill>
+                  <pic:spPr>
+                    <a:xfrm>
+                      <a:off x="0" y="0"/>
+                      <a:ext cx="5731510" cy="3145790"/>
+                    </a:xfrm>
+                    <a:prstGeom prst="rect">
+                      <a:avLst/>
+                    </a:prstGeom>
+                  </pic:spPr>
+                </pic:pic>
+              </a:graphicData>
+            </a:graphic>
+          </wp:inline>
+        </w:drawing>
       </w:r>
     </w:p>
     <w:p>
@@ -241,7 +585,190 @@
           <w:sz w:val="28"/>
           <w:szCs w:val="28"/>
         </w:rPr>
-        <w:lastRenderedPageBreak/>
+        <w:drawing>
+          <wp:inline distT="0" distB="0" distL="0" distR="0" wp14:anchorId="4C0996BF" wp14:editId="0EF005F7">
+            <wp:extent cx="5731510" cy="3070225"/>
+            <wp:effectExtent l="0" t="0" r="2540" b="0"/>
+            <wp:docPr id="266630455" name="Picture 1"/>
+            <wp:cNvGraphicFramePr>
+              <a:graphicFrameLocks xmlns:a="http://schemas.openxmlformats.org/drawingml/2006/main" noChangeAspect="1"/>
+            </wp:cNvGraphicFramePr>
+            <a:graphic xmlns:a="http://schemas.openxmlformats.org/drawingml/2006/main">
+              <a:graphicData uri="http://schemas.openxmlformats.org/drawingml/2006/picture">
+                <pic:pic xmlns:pic="http://schemas.openxmlformats.org/drawingml/2006/picture">
+                  <pic:nvPicPr>
+                    <pic:cNvPr id="266630455" name=""/>
+                    <pic:cNvPicPr/>
+                  </pic:nvPicPr>
+                  <pic:blipFill>
+                    <a:blip r:embed="rId11"/>
+                    <a:stretch>
+                      <a:fillRect/>
+                    </a:stretch>
+                  </pic:blipFill>
+                  <pic:spPr>
+                    <a:xfrm>
+                      <a:off x="0" y="0"/>
+                      <a:ext cx="5731510" cy="3070225"/>
+                    </a:xfrm>
+                    <a:prstGeom prst="rect">
+                      <a:avLst/>
+                    </a:prstGeom>
+                  </pic:spPr>
+                </pic:pic>
+              </a:graphicData>
+            </a:graphic>
+          </wp:inline>
+        </w:drawing>
+      </w:r>
+    </w:p>
+    <w:p>
+      <w:pPr>
+        <w:rPr>
+          <w:b/>
+          <w:bCs/>
+          <w:sz w:val="24"/>
+          <w:szCs w:val="24"/>
+        </w:rPr>
+      </w:pPr>
+    </w:p>
+    <w:p>
+      <w:pPr>
+        <w:rPr>
+          <w:b/>
+          <w:bCs/>
+          <w:sz w:val="24"/>
+          <w:szCs w:val="24"/>
+        </w:rPr>
+      </w:pPr>
+    </w:p>
+    <w:p>
+      <w:pPr>
+        <w:rPr>
+          <w:b/>
+          <w:bCs/>
+          <w:sz w:val="24"/>
+          <w:szCs w:val="24"/>
+        </w:rPr>
+      </w:pPr>
+    </w:p>
+    <w:p>
+      <w:pPr>
+        <w:rPr>
+          <w:b/>
+          <w:bCs/>
+          <w:sz w:val="24"/>
+          <w:szCs w:val="24"/>
+        </w:rPr>
+      </w:pPr>
+    </w:p>
+    <w:p>
+      <w:pPr>
+        <w:rPr>
+          <w:b/>
+          <w:bCs/>
+          <w:sz w:val="24"/>
+          <w:szCs w:val="24"/>
+        </w:rPr>
+      </w:pPr>
+    </w:p>
+    <w:p>
+      <w:pPr>
+        <w:rPr>
+          <w:b/>
+          <w:bCs/>
+          <w:sz w:val="24"/>
+          <w:szCs w:val="24"/>
+        </w:rPr>
+      </w:pPr>
+      <w:r>
+        <w:rPr>
+          <w:b/>
+          <w:bCs/>
+          <w:sz w:val="24"/>
+          <w:szCs w:val="24"/>
+        </w:rPr>
+        <w:t>Trigger test</w:t>
+      </w:r>
+      <w:r>
+        <w:rPr>
+          <w:b/>
+          <w:bCs/>
+          <w:sz w:val="24"/>
+          <w:szCs w:val="24"/>
+        </w:rPr>
+        <w:t>:</w:t>
+      </w:r>
+    </w:p>
+    <w:p>
+      <w:pPr>
+        <w:rPr>
+          <w:b/>
+          <w:bCs/>
+          <w:sz w:val="24"/>
+          <w:szCs w:val="24"/>
+        </w:rPr>
+      </w:pPr>
+      <w:r>
+        <w:rPr>
+          <w:b/>
+          <w:bCs/>
+          <w:sz w:val="24"/>
+          <w:szCs w:val="24"/>
+        </w:rPr>
+        <w:drawing>
+          <wp:inline distT="0" distB="0" distL="0" distR="0" wp14:anchorId="52C8D7A2" wp14:editId="457129B7">
+            <wp:extent cx="5731510" cy="3137535"/>
+            <wp:effectExtent l="0" t="0" r="2540" b="5715"/>
+            <wp:docPr id="735877053" name="Picture 1"/>
+            <wp:cNvGraphicFramePr>
+              <a:graphicFrameLocks xmlns:a="http://schemas.openxmlformats.org/drawingml/2006/main" noChangeAspect="1"/>
+            </wp:cNvGraphicFramePr>
+            <a:graphic xmlns:a="http://schemas.openxmlformats.org/drawingml/2006/main">
+              <a:graphicData uri="http://schemas.openxmlformats.org/drawingml/2006/picture">
+                <pic:pic xmlns:pic="http://schemas.openxmlformats.org/drawingml/2006/picture">
+                  <pic:nvPicPr>
+                    <pic:cNvPr id="735877053" name=""/>
+                    <pic:cNvPicPr/>
+                  </pic:nvPicPr>
+                  <pic:blipFill>
+                    <a:blip r:embed="rId12"/>
+                    <a:stretch>
+                      <a:fillRect/>
+                    </a:stretch>
+                  </pic:blipFill>
+                  <pic:spPr>
+                    <a:xfrm>
+                      <a:off x="0" y="0"/>
+                      <a:ext cx="5731510" cy="3137535"/>
+                    </a:xfrm>
+                    <a:prstGeom prst="rect">
+                      <a:avLst/>
+                    </a:prstGeom>
+                  </pic:spPr>
+                </pic:pic>
+              </a:graphicData>
+            </a:graphic>
+          </wp:inline>
+        </w:drawing>
+      </w:r>
+    </w:p>
+    <w:p>
+      <w:pPr>
+        <w:rPr>
+          <w:b/>
+          <w:bCs/>
+          <w:sz w:val="28"/>
+          <w:szCs w:val="28"/>
+        </w:rPr>
+      </w:pPr>
+      <w:r>
+        <w:rPr>
+          <w:b/>
+          <w:bCs/>
+          <w:sz w:val="28"/>
+          <w:szCs w:val="28"/>
+        </w:rPr>
         <w:t>Exercise 4: Modify a Trigger using SSMS</w:t>
       </w:r>
     </w:p>
@@ -261,6 +788,233 @@
           <w:sz w:val="28"/>
           <w:szCs w:val="28"/>
         </w:rPr>
+        <w:drawing>
+          <wp:inline distT="0" distB="0" distL="0" distR="0" wp14:anchorId="54B0DAC4" wp14:editId="67B2DF1C">
+            <wp:extent cx="5731510" cy="3221355"/>
+            <wp:effectExtent l="0" t="0" r="2540" b="0"/>
+            <wp:docPr id="692877824" name="Picture 1"/>
+            <wp:cNvGraphicFramePr>
+              <a:graphicFrameLocks xmlns:a="http://schemas.openxmlformats.org/drawingml/2006/main" noChangeAspect="1"/>
+            </wp:cNvGraphicFramePr>
+            <a:graphic xmlns:a="http://schemas.openxmlformats.org/drawingml/2006/main">
+              <a:graphicData uri="http://schemas.openxmlformats.org/drawingml/2006/picture">
+                <pic:pic xmlns:pic="http://schemas.openxmlformats.org/drawingml/2006/picture">
+                  <pic:nvPicPr>
+                    <pic:cNvPr id="692877824" name=""/>
+                    <pic:cNvPicPr/>
+                  </pic:nvPicPr>
+                  <pic:blipFill>
+                    <a:blip r:embed="rId13"/>
+                    <a:stretch>
+                      <a:fillRect/>
+                    </a:stretch>
+                  </pic:blipFill>
+                  <pic:spPr>
+                    <a:xfrm>
+                      <a:off x="0" y="0"/>
+                      <a:ext cx="5731510" cy="3221355"/>
+                    </a:xfrm>
+                    <a:prstGeom prst="rect">
+                      <a:avLst/>
+                    </a:prstGeom>
+                  </pic:spPr>
+                </pic:pic>
+              </a:graphicData>
+            </a:graphic>
+          </wp:inline>
+        </w:drawing>
+      </w:r>
+    </w:p>
+    <w:p>
+      <w:pPr>
+        <w:rPr>
+          <w:b/>
+          <w:bCs/>
+          <w:sz w:val="24"/>
+          <w:szCs w:val="24"/>
+        </w:rPr>
+      </w:pPr>
+    </w:p>
+    <w:p>
+      <w:pPr>
+        <w:rPr>
+          <w:b/>
+          <w:bCs/>
+          <w:sz w:val="24"/>
+          <w:szCs w:val="24"/>
+        </w:rPr>
+      </w:pPr>
+    </w:p>
+    <w:p>
+      <w:pPr>
+        <w:rPr>
+          <w:b/>
+          <w:bCs/>
+          <w:sz w:val="24"/>
+          <w:szCs w:val="24"/>
+        </w:rPr>
+      </w:pPr>
+    </w:p>
+    <w:p>
+      <w:pPr>
+        <w:rPr>
+          <w:b/>
+          <w:bCs/>
+          <w:sz w:val="24"/>
+          <w:szCs w:val="24"/>
+        </w:rPr>
+      </w:pPr>
+    </w:p>
+    <w:p>
+      <w:pPr>
+        <w:rPr>
+          <w:b/>
+          <w:bCs/>
+          <w:sz w:val="24"/>
+          <w:szCs w:val="24"/>
+        </w:rPr>
+      </w:pPr>
+    </w:p>
+    <w:p>
+      <w:pPr>
+        <w:rPr>
+          <w:b/>
+          <w:bCs/>
+          <w:sz w:val="24"/>
+          <w:szCs w:val="24"/>
+        </w:rPr>
+      </w:pPr>
+      <w:r>
+        <w:rPr>
+          <w:b/>
+          <w:bCs/>
+          <w:sz w:val="24"/>
+          <w:szCs w:val="24"/>
+        </w:rPr>
+        <w:t>Trigger test:</w:t>
+      </w:r>
+    </w:p>
+    <w:p>
+      <w:pPr>
+        <w:rPr>
+          <w:b/>
+          <w:bCs/>
+          <w:sz w:val="24"/>
+          <w:szCs w:val="24"/>
+        </w:rPr>
+      </w:pPr>
+      <w:r>
+        <w:rPr>
+          <w:b/>
+          <w:bCs/>
+          <w:sz w:val="24"/>
+          <w:szCs w:val="24"/>
+        </w:rPr>
+        <w:drawing>
+          <wp:inline distT="0" distB="0" distL="0" distR="0" wp14:anchorId="10D1BB55" wp14:editId="29A019D9">
+            <wp:extent cx="2751667" cy="5067935"/>
+            <wp:effectExtent l="0" t="0" r="0" b="0"/>
+            <wp:docPr id="231152343" name="Picture 1"/>
+            <wp:cNvGraphicFramePr>
+              <a:graphicFrameLocks xmlns:a="http://schemas.openxmlformats.org/drawingml/2006/main" noChangeAspect="1"/>
+            </wp:cNvGraphicFramePr>
+            <a:graphic xmlns:a="http://schemas.openxmlformats.org/drawingml/2006/main">
+              <a:graphicData uri="http://schemas.openxmlformats.org/drawingml/2006/picture">
+                <pic:pic xmlns:pic="http://schemas.openxmlformats.org/drawingml/2006/picture">
+                  <pic:nvPicPr>
+                    <pic:cNvPr id="231152343" name=""/>
+                    <pic:cNvPicPr/>
+                  </pic:nvPicPr>
+                  <pic:blipFill rotWithShape="1">
+                    <a:blip r:embed="rId14"/>
+                    <a:srcRect r="51990"/>
+                    <a:stretch>
+                      <a:fillRect/>
+                    </a:stretch>
+                  </pic:blipFill>
+                  <pic:spPr bwMode="auto">
+                    <a:xfrm>
+                      <a:off x="0" y="0"/>
+                      <a:ext cx="2751667" cy="5067935"/>
+                    </a:xfrm>
+                    <a:prstGeom prst="rect">
+                      <a:avLst/>
+                    </a:prstGeom>
+                    <a:ln>
+                      <a:noFill/>
+                    </a:ln>
+                    <a:extLst>
+                      <a:ext uri="{53640926-AAD7-44D8-BBD7-CCE9431645EC}">
+                        <a14:shadowObscured xmlns:a14="http://schemas.microsoft.com/office/drawing/2010/main"/>
+                      </a:ext>
+                    </a:extLst>
+                  </pic:spPr>
+                </pic:pic>
+              </a:graphicData>
+            </a:graphic>
+          </wp:inline>
+        </w:drawing>
+      </w:r>
+      <w:r>
+        <w:rPr>
+          <w:b/>
+          <w:bCs/>
+          <w:sz w:val="24"/>
+          <w:szCs w:val="24"/>
+        </w:rPr>
+        <w:drawing>
+          <wp:inline distT="0" distB="0" distL="0" distR="0" wp14:anchorId="686E98F9" wp14:editId="160D46AA">
+            <wp:extent cx="2554522" cy="5065748"/>
+            <wp:effectExtent l="0" t="0" r="0" b="1905"/>
+            <wp:docPr id="1332435029" name="Picture 1"/>
+            <wp:cNvGraphicFramePr>
+              <a:graphicFrameLocks xmlns:a="http://schemas.openxmlformats.org/drawingml/2006/main" noChangeAspect="1"/>
+            </wp:cNvGraphicFramePr>
+            <a:graphic xmlns:a="http://schemas.openxmlformats.org/drawingml/2006/main">
+              <a:graphicData uri="http://schemas.openxmlformats.org/drawingml/2006/picture">
+                <pic:pic xmlns:pic="http://schemas.openxmlformats.org/drawingml/2006/picture">
+                  <pic:nvPicPr>
+                    <pic:cNvPr id="1332435029" name=""/>
+                    <pic:cNvPicPr/>
+                  </pic:nvPicPr>
+                  <pic:blipFill>
+                    <a:blip r:embed="rId15"/>
+                    <a:stretch>
+                      <a:fillRect/>
+                    </a:stretch>
+                  </pic:blipFill>
+                  <pic:spPr>
+                    <a:xfrm>
+                      <a:off x="0" y="0"/>
+                      <a:ext cx="2561954" cy="5080485"/>
+                    </a:xfrm>
+                    <a:prstGeom prst="rect">
+                      <a:avLst/>
+                    </a:prstGeom>
+                  </pic:spPr>
+                </pic:pic>
+              </a:graphicData>
+            </a:graphic>
+          </wp:inline>
+        </w:drawing>
+      </w:r>
+    </w:p>
+    <w:p>
+      <w:pPr>
+        <w:rPr>
+          <w:b/>
+          <w:bCs/>
+          <w:sz w:val="28"/>
+          <w:szCs w:val="28"/>
+        </w:rPr>
+      </w:pPr>
+      <w:r>
+        <w:rPr>
+          <w:b/>
+          <w:bCs/>
+          <w:sz w:val="28"/>
+          <w:szCs w:val="28"/>
+        </w:rPr>
         <w:t>Exercise 5: Delete a Trigger</w:t>
       </w:r>
     </w:p>
@@ -277,6 +1031,119 @@
         <w:rPr>
           <w:b/>
           <w:bCs/>
+          <w:noProof/>
+          <w:sz w:val="28"/>
+          <w:szCs w:val="28"/>
+        </w:rPr>
+        <w:drawing>
+          <wp:inline distT="0" distB="0" distL="0" distR="0" wp14:anchorId="7614113A" wp14:editId="7D2D8AC1">
+            <wp:extent cx="5731510" cy="2683933"/>
+            <wp:effectExtent l="0" t="0" r="2540" b="2540"/>
+            <wp:docPr id="295596542" name="Picture 1"/>
+            <wp:cNvGraphicFramePr>
+              <a:graphicFrameLocks xmlns:a="http://schemas.openxmlformats.org/drawingml/2006/main" noChangeAspect="1"/>
+            </wp:cNvGraphicFramePr>
+            <a:graphic xmlns:a="http://schemas.openxmlformats.org/drawingml/2006/main">
+              <a:graphicData uri="http://schemas.openxmlformats.org/drawingml/2006/picture">
+                <pic:pic xmlns:pic="http://schemas.openxmlformats.org/drawingml/2006/picture">
+                  <pic:nvPicPr>
+                    <pic:cNvPr id="295596542" name="Picture 295596542"/>
+                    <pic:cNvPicPr/>
+                  </pic:nvPicPr>
+                  <pic:blipFill>
+                    <a:blip r:embed="rId16" cstate="print">
+                      <a:extLst>
+                        <a:ext uri="{28A0092B-C50C-407E-A947-70E740481C1C}">
+                          <a14:useLocalDpi xmlns:a14="http://schemas.microsoft.com/office/drawing/2010/main" val="0"/>
+                        </a:ext>
+                      </a:extLst>
+                    </a:blip>
+                    <a:stretch>
+                      <a:fillRect/>
+                    </a:stretch>
+                  </pic:blipFill>
+                  <pic:spPr>
+                    <a:xfrm>
+                      <a:off x="0" y="0"/>
+                      <a:ext cx="5733219" cy="2684733"/>
+                    </a:xfrm>
+                    <a:prstGeom prst="rect">
+                      <a:avLst/>
+                    </a:prstGeom>
+                  </pic:spPr>
+                </pic:pic>
+              </a:graphicData>
+            </a:graphic>
+          </wp:inline>
+        </w:drawing>
+      </w:r>
+    </w:p>
+    <w:p>
+      <w:pPr>
+        <w:rPr>
+          <w:b/>
+          <w:bCs/>
+          <w:sz w:val="28"/>
+          <w:szCs w:val="28"/>
+        </w:rPr>
+      </w:pPr>
+      <w:r>
+        <w:rPr>
+          <w:b/>
+          <w:bCs/>
+          <w:sz w:val="28"/>
+          <w:szCs w:val="28"/>
+        </w:rPr>
+        <w:drawing>
+          <wp:inline distT="0" distB="0" distL="0" distR="0" wp14:anchorId="304DD71A" wp14:editId="3541CD8C">
+            <wp:extent cx="3322608" cy="4587638"/>
+            <wp:effectExtent l="0" t="0" r="0" b="3810"/>
+            <wp:docPr id="612212017" name="Picture 1"/>
+            <wp:cNvGraphicFramePr>
+              <a:graphicFrameLocks xmlns:a="http://schemas.openxmlformats.org/drawingml/2006/main" noChangeAspect="1"/>
+            </wp:cNvGraphicFramePr>
+            <a:graphic xmlns:a="http://schemas.openxmlformats.org/drawingml/2006/main">
+              <a:graphicData uri="http://schemas.openxmlformats.org/drawingml/2006/picture">
+                <pic:pic xmlns:pic="http://schemas.openxmlformats.org/drawingml/2006/picture">
+                  <pic:nvPicPr>
+                    <pic:cNvPr id="612212017" name=""/>
+                    <pic:cNvPicPr/>
+                  </pic:nvPicPr>
+                  <pic:blipFill>
+                    <a:blip r:embed="rId17"/>
+                    <a:stretch>
+                      <a:fillRect/>
+                    </a:stretch>
+                  </pic:blipFill>
+                  <pic:spPr>
+                    <a:xfrm>
+                      <a:off x="0" y="0"/>
+                      <a:ext cx="3322608" cy="4587638"/>
+                    </a:xfrm>
+                    <a:prstGeom prst="rect">
+                      <a:avLst/>
+                    </a:prstGeom>
+                  </pic:spPr>
+                </pic:pic>
+              </a:graphicData>
+            </a:graphic>
+          </wp:inline>
+        </w:drawing>
+      </w:r>
+    </w:p>
+    <w:p>
+      <w:pPr>
+        <w:rPr>
+          <w:b/>
+          <w:bCs/>
+          <w:sz w:val="28"/>
+          <w:szCs w:val="28"/>
+        </w:rPr>
+      </w:pPr>
+      <w:r>
+        <w:rPr>
+          <w:b/>
+          <w:bCs/>
           <w:sz w:val="28"/>
           <w:szCs w:val="28"/>
         </w:rPr>
@@ -288,18 +1155,241 @@
         <w:rPr>
           <w:b/>
           <w:bCs/>
+          <w:sz w:val="24"/>
+          <w:szCs w:val="24"/>
+        </w:rPr>
+      </w:pPr>
+      <w:r>
+        <w:rPr>
+          <w:b/>
+          <w:bCs/>
+          <w:sz w:val="24"/>
+          <w:szCs w:val="24"/>
+        </w:rPr>
+        <w:t>Alter DB:</w:t>
+      </w:r>
+    </w:p>
+    <w:p>
+      <w:pPr>
+        <w:rPr>
+          <w:b/>
+          <w:bCs/>
+          <w:sz w:val="24"/>
+          <w:szCs w:val="24"/>
+        </w:rPr>
+      </w:pPr>
+      <w:r>
+        <w:rPr>
+          <w:b/>
+          <w:bCs/>
+          <w:sz w:val="24"/>
+          <w:szCs w:val="24"/>
+        </w:rPr>
+        <w:drawing>
+          <wp:inline distT="0" distB="0" distL="0" distR="0" wp14:anchorId="0A7F2A53" wp14:editId="66B842FC">
+            <wp:extent cx="5731510" cy="3234267"/>
+            <wp:effectExtent l="0" t="0" r="2540" b="4445"/>
+            <wp:docPr id="801954219" name="Picture 1"/>
+            <wp:cNvGraphicFramePr>
+              <a:graphicFrameLocks xmlns:a="http://schemas.openxmlformats.org/drawingml/2006/main" noChangeAspect="1"/>
+            </wp:cNvGraphicFramePr>
+            <a:graphic xmlns:a="http://schemas.openxmlformats.org/drawingml/2006/main">
+              <a:graphicData uri="http://schemas.openxmlformats.org/drawingml/2006/picture">
+                <pic:pic xmlns:pic="http://schemas.openxmlformats.org/drawingml/2006/picture">
+                  <pic:nvPicPr>
+                    <pic:cNvPr id="801954219" name=""/>
+                    <pic:cNvPicPr/>
+                  </pic:nvPicPr>
+                  <pic:blipFill>
+                    <a:blip r:embed="rId18"/>
+                    <a:stretch>
+                      <a:fillRect/>
+                    </a:stretch>
+                  </pic:blipFill>
+                  <pic:spPr>
+                    <a:xfrm>
+                      <a:off x="0" y="0"/>
+                      <a:ext cx="5732549" cy="3234853"/>
+                    </a:xfrm>
+                    <a:prstGeom prst="rect">
+                      <a:avLst/>
+                    </a:prstGeom>
+                  </pic:spPr>
+                </pic:pic>
+              </a:graphicData>
+            </a:graphic>
+          </wp:inline>
+        </w:drawing>
+      </w:r>
+    </w:p>
+    <w:p>
+      <w:pPr>
+        <w:rPr>
+          <w:b/>
+          <w:bCs/>
+          <w:sz w:val="24"/>
+          <w:szCs w:val="24"/>
+        </w:rPr>
+      </w:pPr>
+      <w:r>
+        <w:rPr>
+          <w:b/>
+          <w:bCs/>
+          <w:sz w:val="24"/>
+          <w:szCs w:val="24"/>
+        </w:rPr>
+        <w:t>Trigger Creation:</w:t>
+      </w:r>
+    </w:p>
+    <w:p>
+      <w:pPr>
+        <w:rPr>
+          <w:b/>
+          <w:bCs/>
+          <w:sz w:val="24"/>
+          <w:szCs w:val="24"/>
+        </w:rPr>
+      </w:pPr>
+      <w:r>
+        <w:rPr>
+          <w:b/>
+          <w:bCs/>
+          <w:sz w:val="24"/>
+          <w:szCs w:val="24"/>
+        </w:rPr>
+        <w:drawing>
+          <wp:inline distT="0" distB="0" distL="0" distR="0" wp14:anchorId="51B4A9DB" wp14:editId="5BB90502">
+            <wp:extent cx="5731510" cy="3124835"/>
+            <wp:effectExtent l="0" t="0" r="2540" b="0"/>
+            <wp:docPr id="1086707189" name="Picture 1"/>
+            <wp:cNvGraphicFramePr>
+              <a:graphicFrameLocks xmlns:a="http://schemas.openxmlformats.org/drawingml/2006/main" noChangeAspect="1"/>
+            </wp:cNvGraphicFramePr>
+            <a:graphic xmlns:a="http://schemas.openxmlformats.org/drawingml/2006/main">
+              <a:graphicData uri="http://schemas.openxmlformats.org/drawingml/2006/picture">
+                <pic:pic xmlns:pic="http://schemas.openxmlformats.org/drawingml/2006/picture">
+                  <pic:nvPicPr>
+                    <pic:cNvPr id="1086707189" name=""/>
+                    <pic:cNvPicPr/>
+                  </pic:nvPicPr>
+                  <pic:blipFill>
+                    <a:blip r:embed="rId19"/>
+                    <a:stretch>
+                      <a:fillRect/>
+                    </a:stretch>
+                  </pic:blipFill>
+                  <pic:spPr>
+                    <a:xfrm>
+                      <a:off x="0" y="0"/>
+                      <a:ext cx="5731510" cy="3124835"/>
+                    </a:xfrm>
+                    <a:prstGeom prst="rect">
+                      <a:avLst/>
+                    </a:prstGeom>
+                  </pic:spPr>
+                </pic:pic>
+              </a:graphicData>
+            </a:graphic>
+          </wp:inline>
+        </w:drawing>
+      </w:r>
+    </w:p>
+    <w:p>
+      <w:pPr>
+        <w:rPr>
+          <w:b/>
+          <w:bCs/>
+          <w:sz w:val="24"/>
+          <w:szCs w:val="24"/>
+        </w:rPr>
+      </w:pPr>
+      <w:r>
+        <w:rPr>
+          <w:b/>
+          <w:bCs/>
+          <w:sz w:val="24"/>
+          <w:szCs w:val="24"/>
+        </w:rPr>
+        <w:t>Trigger test:</w:t>
+      </w:r>
+    </w:p>
+    <w:p>
+      <w:pPr>
+        <w:rPr>
+          <w:b/>
+          <w:bCs/>
+          <w:sz w:val="24"/>
+          <w:szCs w:val="24"/>
+        </w:rPr>
+      </w:pPr>
+      <w:r>
+        <w:rPr>
+          <w:b/>
+          <w:bCs/>
+          <w:noProof/>
+          <w:sz w:val="24"/>
+          <w:szCs w:val="24"/>
+        </w:rPr>
+        <w:drawing>
+          <wp:inline distT="0" distB="0" distL="0" distR="0" wp14:anchorId="41373E9F" wp14:editId="60CC9381">
+            <wp:extent cx="5731510" cy="3183890"/>
+            <wp:effectExtent l="0" t="0" r="2540" b="0"/>
+            <wp:docPr id="1581964632" name="Picture 2"/>
+            <wp:cNvGraphicFramePr>
+              <a:graphicFrameLocks xmlns:a="http://schemas.openxmlformats.org/drawingml/2006/main" noChangeAspect="1"/>
+            </wp:cNvGraphicFramePr>
+            <a:graphic xmlns:a="http://schemas.openxmlformats.org/drawingml/2006/main">
+              <a:graphicData uri="http://schemas.openxmlformats.org/drawingml/2006/picture">
+                <pic:pic xmlns:pic="http://schemas.openxmlformats.org/drawingml/2006/picture">
+                  <pic:nvPicPr>
+                    <pic:cNvPr id="1581964632" name="Picture 1581964632"/>
+                    <pic:cNvPicPr/>
+                  </pic:nvPicPr>
+                  <pic:blipFill>
+                    <a:blip r:embed="rId20">
+                      <a:extLst>
+                        <a:ext uri="{28A0092B-C50C-407E-A947-70E740481C1C}">
+                          <a14:useLocalDpi xmlns:a14="http://schemas.microsoft.com/office/drawing/2010/main" val="0"/>
+                        </a:ext>
+                      </a:extLst>
+                    </a:blip>
+                    <a:stretch>
+                      <a:fillRect/>
+                    </a:stretch>
+                  </pic:blipFill>
+                  <pic:spPr>
+                    <a:xfrm>
+                      <a:off x="0" y="0"/>
+                      <a:ext cx="5731510" cy="3183890"/>
+                    </a:xfrm>
+                    <a:prstGeom prst="rect">
+                      <a:avLst/>
+                    </a:prstGeom>
+                  </pic:spPr>
+                </pic:pic>
+              </a:graphicData>
+            </a:graphic>
+          </wp:inline>
+        </w:drawing>
+      </w:r>
+    </w:p>
+    <w:p>
+      <w:pPr>
+        <w:rPr>
+          <w:b/>
+          <w:bCs/>
           <w:sz w:val="28"/>
           <w:szCs w:val="28"/>
         </w:rPr>
       </w:pPr>
     </w:p>
     <w:sectPr>
-      <w:headerReference w:type="even" r:id="rId8"/>
-      <w:headerReference w:type="default" r:id="rId9"/>
-      <w:footerReference w:type="even" r:id="rId10"/>
-      <w:footerReference w:type="default" r:id="rId11"/>
-      <w:headerReference w:type="first" r:id="rId12"/>
-      <w:footerReference w:type="first" r:id="rId13"/>
+      <w:headerReference w:type="even" r:id="rId21"/>
+      <w:headerReference w:type="default" r:id="rId22"/>
+      <w:footerReference w:type="even" r:id="rId23"/>
+      <w:footerReference w:type="default" r:id="rId24"/>
+      <w:headerReference w:type="first" r:id="rId25"/>
+      <w:footerReference w:type="first" r:id="rId26"/>
       <w:pgSz w:w="11906" w:h="16838"/>
       <w:pgMar w:top="1440" w:right="1440" w:bottom="1440" w:left="1440" w:header="708" w:footer="708" w:gutter="0"/>
       <w:cols w:space="708"/>

</xml_diff>